<commit_message>
Refine final report dashboard contribution
</commit_message>
<xml_diff>
--- a/Final_Report.docx
+++ b/Final_Report.docx
@@ -308,11 +308,7 @@
           </w:tcPr>
           <w:p>
             <w:r>
-              <w:rPr>
-                <w:rFonts w:ascii="Calibri" w:hAnsi="Calibri"/>
-                <w:sz w:val="18"/>
-              </w:rPr>
-              <w:t>Zhou Can</w:t>
+              <w:t>Zhou Can (CandaceZcc)</w:t>
             </w:r>
           </w:p>
         </w:tc>
@@ -322,11 +318,7 @@
           </w:tcPr>
           <w:p>
             <w:r>
-              <w:rPr>
-                <w:rFonts w:ascii="Calibri" w:hAnsi="Calibri"/>
-                <w:sz w:val="18"/>
-              </w:rPr>
-              <w:t>Project coordination and dashboard UI integration.</w:t>
+              <w:t>Project coordination and main dashboard integration, including the Streamlit layout, shared filter panel, KPI cards, Overview/Revenue/Genres/Time views, Plotly chart layout, dark UI styling, and filter-aware interaction between charts, metrics, and export results.</w:t>
             </w:r>
           </w:p>
         </w:tc>
@@ -1287,6 +1279,12 @@
           <w:szCs w:val="20"/>
         </w:rPr>
         <w:t>The dashboard is built with Streamlit and organized through a modular Python structure. streamlit_app.py is the main entry point and connects data loading, filtering, KPI rendering, chart panels, export, chi-square analysis, regression, and insights.</w:t>
+      </w:r>
+    </w:p>
+    <w:p>
+      <w:pPr/>
+      <w:r>
+        <w:t>For the main dashboard integration, the key design challenge was to keep all analytical views controlled by one shared filtering state. The year range, genre selection, and minimum vote threshold are applied once and then reused by KPI cards, Plotly charts, view switching, and CSV export. This makes the system behave as one coherent exploratory dashboard instead of several independent static charts.</w:t>
       </w:r>
     </w:p>
     <w:p>

</xml_diff>